<commit_message>
ciudad en plantilla y logica
</commit_message>
<xml_diff>
--- a/plantillas/venta_contrato_vehiculo_PN_v2.docx
+++ b/plantillas/venta_contrato_vehiculo_PN_v2.docx
@@ -512,6 +512,13 @@
           <w:lang w:val="es-ES_tradnl"/>
         </w:rPr>
         <w:t>,</w:t>
+      </w:r>
+      <w:r>
+        <w:rPr>
+          <w:rFonts w:cstheme="minorHAnsi"/>
+          <w:lang w:val="es-ES_tradnl"/>
+        </w:rPr>
+        <w:t>${CIUDAD_C}</w:t>
       </w:r>
       <w:r>
         <w:rPr>

</xml_diff>